<commit_message>
📄 Bug Report Halyzia v2.0.1 — généré automatiquement
</commit_message>
<xml_diff>
--- a/reports/Bug_Report_Halyzia_V2.0.1.docx
+++ b/reports/Bug_Report_Halyzia_V2.0.1.docx
@@ -135,6 +135,89 @@
       <w:r>
         <w:t xml:space="preserve">indique que l’issue a été testée mais non validée</w:t>
       </w:r>
+    </w:p>
+    <w:p>
+      <w:pPr>
+        <w:spacing w:after="200"/>
+      </w:pPr>
+    </w:p>
+    <w:p>
+      <w:pPr>
+        <w:spacing w:before="300" w:after="150"/>
+      </w:pPr>
+      <w:r>
+        <w:t xml:space="preserve">Nombre de sessions de tests pour cette version : 2</w:t>
+      </w:r>
+    </w:p>
+    <w:p>
+      <w:pPr>
+        <w:spacing w:after="100"/>
+      </w:pPr>
+      <w:r>
+        <w:t xml:space="preserve">Liste des sessions de tests et leur nombre d'anomalies :</w:t>
+      </w:r>
+    </w:p>
+    <w:p>
+      <w:pPr>
+        <w:pStyle w:val="ListParagraph"/>
+        <w:numPr>
+          <w:ilvl w:val="0"/>
+          <w:numId w:val="1"/>
+        </w:numPr>
+      </w:pPr>
+      <w:r>
+        <w:rPr>
+          <w:b/>
+          <w:bCs/>
+        </w:rPr>
+        <w:t xml:space="preserve">Rapport : test_messaouda_2026-05-04.md : </w:t>
+      </w:r>
+      <w:r>
+        <w:t xml:space="preserve">1 issue</w:t>
+      </w:r>
+    </w:p>
+    <w:p>
+      <w:pPr>
+        <w:pStyle w:val="ListParagraph"/>
+        <w:numPr>
+          <w:ilvl w:val="0"/>
+          <w:numId w:val="1"/>
+        </w:numPr>
+      </w:pPr>
+      <w:r>
+        <w:rPr>
+          <w:b/>
+          <w:bCs/>
+        </w:rPr>
+        <w:t xml:space="preserve">Rapport de Session : test_Messaouda_2026-06-19.md : </w:t>
+      </w:r>
+      <w:r>
+        <w:t xml:space="preserve">1 issue</w:t>
+      </w:r>
+    </w:p>
+    <w:p>
+      <w:pPr>
+        <w:pStyle w:val="ListParagraph"/>
+        <w:numPr>
+          <w:ilvl w:val="0"/>
+          <w:numId w:val="1"/>
+        </w:numPr>
+      </w:pPr>
+      <w:r>
+        <w:rPr>
+          <w:b/>
+          <w:bCs/>
+        </w:rPr>
+        <w:t xml:space="preserve">Issues hors Session (Backlogs / Externes) : </w:t>
+      </w:r>
+      <w:r>
+        <w:t xml:space="preserve">1 issue</w:t>
+      </w:r>
+    </w:p>
+    <w:p>
+      <w:pPr>
+        <w:spacing w:after="300"/>
+      </w:pPr>
     </w:p>
     <w:p>
       <w:pPr>

</xml_diff>